<commit_message>
se actualiza documentacion con los cambios hechos
</commit_message>
<xml_diff>
--- a/docs/Canal-de-YouTube.docx
+++ b/docs/Canal-de-YouTube.docx
@@ -344,6 +344,14 @@
           <w:sz w:val="22"/>
         </w:rPr>
         <w:t xml:space="preserve"> genera el código y no lo ejecuta. El video lo dice en voz alta.</w:t>
+      </w:r>
+      <w:r>
+        <w:rPr>
+          <w:rFonts w:ascii="Calibri" w:hAnsi="Calibri"/>
+          <w:color w:val="1E293B"/>
+          <w:sz w:val="24"/>
+        </w:rPr>
+        <w:t xml:space="preserve"> Lenguajes es otra ventana: ahí sí se ejecuta Python, JavaScript, TypeScript, Java, C, C++ o C# en la máquina. No se mezcla con el video de traducir.</w:t>
       </w:r>
     </w:p>
     <w:p>

</xml_diff>